<commit_message>
Correction: remove erroneous conflict-of-interest statement and UNICEF double audit rate from protocol v0.1–v0.5
</commit_message>
<xml_diff>
--- a/docs/protocol/files/20261009_O1_Pilot-Design-Report_v0.1.docx
+++ b/docs/protocol/files/20261009_O1_Pilot-Design-Report_v0.1.docx
@@ -120,7 +120,7 @@
           <w:sz w:val="20"/>
           <w:szCs w:val="20"/>
         </w:rPr>
-        <w:t xml:space="preserve"> 0.1, draft for GSR approval (Gate 0). October 2026.</w:t>
+        <w:t xml:space="preserve"> 0.1, draft for GSR approval (Gate 0). October 2026. Correction (17 October 2026): an erroneous conflict-of-interest statement and the related double audit rate for UNICEF cases were removed. The human audit rate is the same for every portfolio.</w:t>
       </w:r>
     </w:p>
     <w:p>
@@ -18410,13 +18410,12 @@
           <w:sz w:val="20"/>
           <w:szCs w:val="20"/>
         </w:rPr>
-        <w:t xml:space="preserve"> Michael Cooper has previously worked with the UNICEF Venture Fund.</w:t>
+        <w:t xml:space="preserve"> None declared. The human audit rate is the same for every portfolio, as set out in Section 8.4.</w:t>
       </w:r>
       <w:r>
         <w:rPr>
           <w:rStyle w:val="FootnoteReference"/>
         </w:rPr>
-        <w:footnoteReference w:id="60"/>
       </w:r>
       <w:r>
         <w:rPr>
@@ -18424,7 +18423,6 @@
           <w:sz w:val="20"/>
           <w:szCs w:val="20"/>
         </w:rPr>
-        <w:t xml:space="preserve"> This is declared. As a mitigation, all UNICEF cases are included in the human audit pool at twice the base rate.</w:t>
       </w:r>
     </w:p>
     <w:p>

</xml_diff>